<commit_message>
Real or nominal GDP lesson v1.2: A4, more answer space, starter table
Co-Authored-By: Claude Opus 5.5 <noreply@anthropic.com>
</commit_message>
<xml_diff>
--- a/resources/a-level-economics-real-or-nominal-gdp/A-Level-Economics-Real-or-Nominal-GDP-Student.docx
+++ b/resources/a-level-economics-real-or-nominal-gdp/A-Level-Economics-Real-or-Nominal-GDP-Student.docx
@@ -40,16 +40,16 @@
         <w:tblLook w:firstColumn="1" w:firstRow="1" w:lastColumn="0" w:lastRow="0" w:noHBand="0" w:noVBand="1" w:val="04A0"/>
       </w:tblPr>
       <w:tblGrid>
-        <w:gridCol w:w="3889"/>
-        <w:gridCol w:w="1650"/>
-        <w:gridCol w:w="1650"/>
-        <w:gridCol w:w="1650"/>
-        <w:gridCol w:w="1650"/>
+        <w:gridCol w:w="3756"/>
+        <w:gridCol w:w="1594"/>
+        <w:gridCol w:w="1594"/>
+        <w:gridCol w:w="1594"/>
+        <w:gridCol w:w="1594"/>
       </w:tblGrid>
       <w:tr>
         <w:tc>
           <w:tcPr>
-            <w:tcW w:type="dxa" w:w="3889"/>
+            <w:tcW w:type="dxa" w:w="3756"/>
             <w:shd w:fill="142D40"/>
             <w:tcBorders>
               <w:top w:val="single" w:sz="4" w:color="D9D9D9"/>
@@ -80,7 +80,7 @@
         </w:tc>
         <w:tc>
           <w:tcPr>
-            <w:tcW w:type="dxa" w:w="1650"/>
+            <w:tcW w:type="dxa" w:w="1594"/>
             <w:shd w:fill="142D40"/>
             <w:tcBorders>
               <w:top w:val="single" w:sz="4" w:color="D9D9D9"/>
@@ -111,7 +111,7 @@
         </w:tc>
         <w:tc>
           <w:tcPr>
-            <w:tcW w:type="dxa" w:w="1650"/>
+            <w:tcW w:type="dxa" w:w="1594"/>
             <w:shd w:fill="142D40"/>
             <w:tcBorders>
               <w:top w:val="single" w:sz="4" w:color="D9D9D9"/>
@@ -142,7 +142,7 @@
         </w:tc>
         <w:tc>
           <w:tcPr>
-            <w:tcW w:type="dxa" w:w="1650"/>
+            <w:tcW w:type="dxa" w:w="1594"/>
             <w:shd w:fill="142D40"/>
             <w:tcBorders>
               <w:top w:val="single" w:sz="4" w:color="D9D9D9"/>
@@ -173,7 +173,7 @@
         </w:tc>
         <w:tc>
           <w:tcPr>
-            <w:tcW w:type="dxa" w:w="1650"/>
+            <w:tcW w:type="dxa" w:w="1594"/>
             <w:shd w:fill="142D40"/>
             <w:tcBorders>
               <w:top w:val="single" w:sz="4" w:color="D9D9D9"/>
@@ -206,7 +206,7 @@
       <w:tr>
         <w:tc>
           <w:tcPr>
-            <w:tcW w:type="dxa" w:w="3889"/>
+            <w:tcW w:type="dxa" w:w="3756"/>
             <w:shd w:fill="FFFFFF"/>
             <w:tcBorders>
               <w:top w:val="single" w:sz="4" w:color="D9D9D9"/>
@@ -237,7 +237,7 @@
         </w:tc>
         <w:tc>
           <w:tcPr>
-            <w:tcW w:type="dxa" w:w="1650"/>
+            <w:tcW w:type="dxa" w:w="1594"/>
             <w:shd w:fill="FFFFFF"/>
             <w:tcBorders>
               <w:top w:val="single" w:sz="4" w:color="D9D9D9"/>
@@ -268,7 +268,7 @@
         </w:tc>
         <w:tc>
           <w:tcPr>
-            <w:tcW w:type="dxa" w:w="1650"/>
+            <w:tcW w:type="dxa" w:w="1594"/>
             <w:shd w:fill="FFFFFF"/>
             <w:tcBorders>
               <w:top w:val="single" w:sz="4" w:color="D9D9D9"/>
@@ -299,7 +299,7 @@
         </w:tc>
         <w:tc>
           <w:tcPr>
-            <w:tcW w:type="dxa" w:w="1650"/>
+            <w:tcW w:type="dxa" w:w="1594"/>
             <w:shd w:fill="FFFFFF"/>
             <w:tcBorders>
               <w:top w:val="single" w:sz="4" w:color="D9D9D9"/>
@@ -330,7 +330,7 @@
         </w:tc>
         <w:tc>
           <w:tcPr>
-            <w:tcW w:type="dxa" w:w="1650"/>
+            <w:tcW w:type="dxa" w:w="1594"/>
             <w:shd w:fill="FFFFFF"/>
             <w:tcBorders>
               <w:top w:val="single" w:sz="4" w:color="D9D9D9"/>
@@ -363,7 +363,7 @@
       <w:tr>
         <w:tc>
           <w:tcPr>
-            <w:tcW w:type="dxa" w:w="3889"/>
+            <w:tcW w:type="dxa" w:w="3756"/>
             <w:shd w:fill="F1F5F7"/>
             <w:tcBorders>
               <w:top w:val="single" w:sz="4" w:color="D9D9D9"/>
@@ -394,7 +394,7 @@
         </w:tc>
         <w:tc>
           <w:tcPr>
-            <w:tcW w:type="dxa" w:w="1650"/>
+            <w:tcW w:type="dxa" w:w="1594"/>
             <w:shd w:fill="F1F5F7"/>
             <w:tcBorders>
               <w:top w:val="single" w:sz="4" w:color="D9D9D9"/>
@@ -425,7 +425,7 @@
         </w:tc>
         <w:tc>
           <w:tcPr>
-            <w:tcW w:type="dxa" w:w="1650"/>
+            <w:tcW w:type="dxa" w:w="1594"/>
             <w:shd w:fill="F1F5F7"/>
             <w:tcBorders>
               <w:top w:val="single" w:sz="4" w:color="D9D9D9"/>
@@ -456,7 +456,7 @@
         </w:tc>
         <w:tc>
           <w:tcPr>
-            <w:tcW w:type="dxa" w:w="1650"/>
+            <w:tcW w:type="dxa" w:w="1594"/>
             <w:shd w:fill="F1F5F7"/>
             <w:tcBorders>
               <w:top w:val="single" w:sz="4" w:color="D9D9D9"/>
@@ -487,7 +487,7 @@
         </w:tc>
         <w:tc>
           <w:tcPr>
-            <w:tcW w:type="dxa" w:w="1650"/>
+            <w:tcW w:type="dxa" w:w="1594"/>
             <w:shd w:fill="F1F5F7"/>
             <w:tcBorders>
               <w:top w:val="single" w:sz="4" w:color="D9D9D9"/>
@@ -520,7 +520,7 @@
       <w:tr>
         <w:tc>
           <w:tcPr>
-            <w:tcW w:type="dxa" w:w="3889"/>
+            <w:tcW w:type="dxa" w:w="3756"/>
             <w:shd w:fill="FFFFFF"/>
             <w:tcBorders>
               <w:top w:val="single" w:sz="4" w:color="D9D9D9"/>
@@ -551,7 +551,7 @@
         </w:tc>
         <w:tc>
           <w:tcPr>
-            <w:tcW w:type="dxa" w:w="1650"/>
+            <w:tcW w:type="dxa" w:w="1594"/>
             <w:shd w:fill="FFFFFF"/>
             <w:tcBorders>
               <w:top w:val="single" w:sz="4" w:color="D9D9D9"/>
@@ -582,7 +582,7 @@
         </w:tc>
         <w:tc>
           <w:tcPr>
-            <w:tcW w:type="dxa" w:w="1650"/>
+            <w:tcW w:type="dxa" w:w="1594"/>
             <w:shd w:fill="FFFFFF"/>
             <w:tcBorders>
               <w:top w:val="single" w:sz="4" w:color="D9D9D9"/>
@@ -613,7 +613,7 @@
         </w:tc>
         <w:tc>
           <w:tcPr>
-            <w:tcW w:type="dxa" w:w="1650"/>
+            <w:tcW w:type="dxa" w:w="1594"/>
             <w:shd w:fill="FFFFFF"/>
             <w:tcBorders>
               <w:top w:val="single" w:sz="4" w:color="D9D9D9"/>
@@ -644,7 +644,7 @@
         </w:tc>
         <w:tc>
           <w:tcPr>
-            <w:tcW w:type="dxa" w:w="1650"/>
+            <w:tcW w:type="dxa" w:w="1594"/>
             <w:shd w:fill="FFFFFF"/>
             <w:tcBorders>
               <w:top w:val="single" w:sz="4" w:color="D9D9D9"/>
@@ -700,7 +700,7 @@
                     <pic:cNvPicPr/>
                   </pic:nvPicPr>
                   <pic:blipFill>
-                    <a:blip r:embed="rId9"/>
+                    <a:blip r:embed="rId10"/>
                     <a:stretch>
                       <a:fillRect/>
                     </a:stretch>
@@ -734,8 +734,492 @@
     </w:p>
     <w:p>
       <w:r>
-        <w:t>Write N (nominal) or R (real), and T (total) or P (per person), for each: (i) GDP measured at the prices of the year it was produced ___ (ii) GDP measured at constant prices of a base year ___ (iii) GDP divided by the population ___ (iv) the figure whose rate of change is normally used as the measure of economic growth ___</w:t>
+        <w:t>Write N (nominal) or R (real), and T (total) or P (per person), for each description.</w:t>
       </w:r>
+    </w:p>
+    <w:tbl>
+      <w:tblPr>
+        <w:tblW w:type="auto" w:w="0"/>
+        <w:tblLayout w:type="fixed"/>
+        <w:tblLook w:firstColumn="1" w:firstRow="1" w:lastColumn="0" w:lastRow="0" w:noHBand="0" w:noVBand="1" w:val="04A0"/>
+      </w:tblPr>
+      <w:tblGrid>
+        <w:gridCol w:w="6497"/>
+        <w:gridCol w:w="1827"/>
+        <w:gridCol w:w="1827"/>
+      </w:tblGrid>
+      <w:tr>
+        <w:tc>
+          <w:tcPr>
+            <w:tcW w:type="dxa" w:w="6497"/>
+            <w:shd w:fill="142D40"/>
+            <w:tcBorders>
+              <w:top w:val="single" w:sz="4" w:color="D9D9D9"/>
+              <w:bottom w:val="single" w:sz="4" w:color="D9D9D9"/>
+              <w:left w:val="single" w:sz="4" w:color="D9D9D9"/>
+              <w:right w:val="single" w:sz="4" w:color="D9D9D9"/>
+            </w:tcBorders>
+            <w:tcMar>
+              <w:top w:w="85" w:type="dxa"/>
+              <w:bottom w:w="85" w:type="dxa"/>
+              <w:left w:w="85" w:type="dxa"/>
+              <w:right w:w="85" w:type="dxa"/>
+            </w:tcMar>
+          </w:tcPr>
+          <w:p>
+            <w:pPr>
+              <w:spacing w:after="20" w:line="240" w:lineRule="auto"/>
+            </w:pPr>
+            <w:r>
+              <w:rPr>
+                <w:b/>
+                <w:color w:val="FFFFFF"/>
+                <w:sz w:val="19"/>
+              </w:rPr>
+              <w:t>Description</w:t>
+            </w:r>
+          </w:p>
+        </w:tc>
+        <w:tc>
+          <w:tcPr>
+            <w:tcW w:type="dxa" w:w="1827"/>
+            <w:shd w:fill="142D40"/>
+            <w:tcBorders>
+              <w:top w:val="single" w:sz="4" w:color="D9D9D9"/>
+              <w:bottom w:val="single" w:sz="4" w:color="D9D9D9"/>
+              <w:left w:val="single" w:sz="4" w:color="D9D9D9"/>
+              <w:right w:val="single" w:sz="4" w:color="D9D9D9"/>
+            </w:tcBorders>
+            <w:tcMar>
+              <w:top w:w="85" w:type="dxa"/>
+              <w:bottom w:w="85" w:type="dxa"/>
+              <w:left w:w="85" w:type="dxa"/>
+              <w:right w:w="85" w:type="dxa"/>
+            </w:tcMar>
+          </w:tcPr>
+          <w:p>
+            <w:pPr>
+              <w:spacing w:after="20" w:line="240" w:lineRule="auto"/>
+            </w:pPr>
+            <w:r>
+              <w:rPr>
+                <w:b/>
+                <w:color w:val="FFFFFF"/>
+                <w:sz w:val="19"/>
+              </w:rPr>
+              <w:t>N or R</w:t>
+            </w:r>
+          </w:p>
+        </w:tc>
+        <w:tc>
+          <w:tcPr>
+            <w:tcW w:type="dxa" w:w="1827"/>
+            <w:shd w:fill="142D40"/>
+            <w:tcBorders>
+              <w:top w:val="single" w:sz="4" w:color="D9D9D9"/>
+              <w:bottom w:val="single" w:sz="4" w:color="D9D9D9"/>
+              <w:left w:val="single" w:sz="4" w:color="D9D9D9"/>
+              <w:right w:val="single" w:sz="4" w:color="D9D9D9"/>
+            </w:tcBorders>
+            <w:tcMar>
+              <w:top w:w="85" w:type="dxa"/>
+              <w:bottom w:w="85" w:type="dxa"/>
+              <w:left w:w="85" w:type="dxa"/>
+              <w:right w:w="85" w:type="dxa"/>
+            </w:tcMar>
+          </w:tcPr>
+          <w:p>
+            <w:pPr>
+              <w:spacing w:after="20" w:line="240" w:lineRule="auto"/>
+            </w:pPr>
+            <w:r>
+              <w:rPr>
+                <w:b/>
+                <w:color w:val="FFFFFF"/>
+                <w:sz w:val="19"/>
+              </w:rPr>
+              <w:t>T or P</w:t>
+            </w:r>
+          </w:p>
+        </w:tc>
+      </w:tr>
+      <w:tr>
+        <w:tc>
+          <w:tcPr>
+            <w:tcW w:type="dxa" w:w="6497"/>
+            <w:shd w:fill="FFFFFF"/>
+            <w:tcBorders>
+              <w:top w:val="single" w:sz="4" w:color="D9D9D9"/>
+              <w:bottom w:val="single" w:sz="4" w:color="D9D9D9"/>
+              <w:left w:val="single" w:sz="4" w:color="D9D9D9"/>
+              <w:right w:val="single" w:sz="4" w:color="D9D9D9"/>
+            </w:tcBorders>
+            <w:tcMar>
+              <w:top w:w="85" w:type="dxa"/>
+              <w:bottom w:w="85" w:type="dxa"/>
+              <w:left w:w="85" w:type="dxa"/>
+              <w:right w:w="85" w:type="dxa"/>
+            </w:tcMar>
+          </w:tcPr>
+          <w:p>
+            <w:pPr>
+              <w:spacing w:after="20" w:line="240" w:lineRule="auto"/>
+            </w:pPr>
+            <w:r>
+              <w:rPr>
+                <w:b w:val="0"/>
+                <w:color w:val="000000"/>
+                <w:sz w:val="19"/>
+              </w:rPr>
+              <w:t>(i) GDP measured at the prices of the year it was produced</w:t>
+            </w:r>
+          </w:p>
+        </w:tc>
+        <w:tc>
+          <w:tcPr>
+            <w:tcW w:type="dxa" w:w="1827"/>
+            <w:shd w:fill="FFFFFF"/>
+            <w:tcBorders>
+              <w:top w:val="single" w:sz="4" w:color="D9D9D9"/>
+              <w:bottom w:val="single" w:sz="4" w:color="D9D9D9"/>
+              <w:left w:val="single" w:sz="4" w:color="D9D9D9"/>
+              <w:right w:val="single" w:sz="4" w:color="D9D9D9"/>
+            </w:tcBorders>
+            <w:tcMar>
+              <w:top w:w="85" w:type="dxa"/>
+              <w:bottom w:w="85" w:type="dxa"/>
+              <w:left w:w="85" w:type="dxa"/>
+              <w:right w:w="85" w:type="dxa"/>
+            </w:tcMar>
+          </w:tcPr>
+          <w:p>
+            <w:pPr>
+              <w:spacing w:after="20" w:line="240" w:lineRule="auto"/>
+            </w:pPr>
+            <w:r>
+              <w:rPr>
+                <w:b w:val="0"/>
+                <w:color w:val="000000"/>
+                <w:sz w:val="19"/>
+              </w:rPr>
+            </w:r>
+          </w:p>
+        </w:tc>
+        <w:tc>
+          <w:tcPr>
+            <w:tcW w:type="dxa" w:w="1827"/>
+            <w:shd w:fill="FFFFFF"/>
+            <w:tcBorders>
+              <w:top w:val="single" w:sz="4" w:color="D9D9D9"/>
+              <w:bottom w:val="single" w:sz="4" w:color="D9D9D9"/>
+              <w:left w:val="single" w:sz="4" w:color="D9D9D9"/>
+              <w:right w:val="single" w:sz="4" w:color="D9D9D9"/>
+            </w:tcBorders>
+            <w:tcMar>
+              <w:top w:w="85" w:type="dxa"/>
+              <w:bottom w:w="85" w:type="dxa"/>
+              <w:left w:w="85" w:type="dxa"/>
+              <w:right w:w="85" w:type="dxa"/>
+            </w:tcMar>
+          </w:tcPr>
+          <w:p>
+            <w:pPr>
+              <w:spacing w:after="20" w:line="240" w:lineRule="auto"/>
+            </w:pPr>
+            <w:r>
+              <w:rPr>
+                <w:b w:val="0"/>
+                <w:color w:val="000000"/>
+                <w:sz w:val="19"/>
+              </w:rPr>
+            </w:r>
+          </w:p>
+        </w:tc>
+      </w:tr>
+      <w:tr>
+        <w:tc>
+          <w:tcPr>
+            <w:tcW w:type="dxa" w:w="6497"/>
+            <w:shd w:fill="F1F5F7"/>
+            <w:tcBorders>
+              <w:top w:val="single" w:sz="4" w:color="D9D9D9"/>
+              <w:bottom w:val="single" w:sz="4" w:color="D9D9D9"/>
+              <w:left w:val="single" w:sz="4" w:color="D9D9D9"/>
+              <w:right w:val="single" w:sz="4" w:color="D9D9D9"/>
+            </w:tcBorders>
+            <w:tcMar>
+              <w:top w:w="85" w:type="dxa"/>
+              <w:bottom w:w="85" w:type="dxa"/>
+              <w:left w:w="85" w:type="dxa"/>
+              <w:right w:w="85" w:type="dxa"/>
+            </w:tcMar>
+          </w:tcPr>
+          <w:p>
+            <w:pPr>
+              <w:spacing w:after="20" w:line="240" w:lineRule="auto"/>
+            </w:pPr>
+            <w:r>
+              <w:rPr>
+                <w:b w:val="0"/>
+                <w:color w:val="000000"/>
+                <w:sz w:val="19"/>
+              </w:rPr>
+              <w:t>(ii) GDP measured at constant prices of a base year</w:t>
+            </w:r>
+          </w:p>
+        </w:tc>
+        <w:tc>
+          <w:tcPr>
+            <w:tcW w:type="dxa" w:w="1827"/>
+            <w:shd w:fill="F1F5F7"/>
+            <w:tcBorders>
+              <w:top w:val="single" w:sz="4" w:color="D9D9D9"/>
+              <w:bottom w:val="single" w:sz="4" w:color="D9D9D9"/>
+              <w:left w:val="single" w:sz="4" w:color="D9D9D9"/>
+              <w:right w:val="single" w:sz="4" w:color="D9D9D9"/>
+            </w:tcBorders>
+            <w:tcMar>
+              <w:top w:w="85" w:type="dxa"/>
+              <w:bottom w:w="85" w:type="dxa"/>
+              <w:left w:w="85" w:type="dxa"/>
+              <w:right w:w="85" w:type="dxa"/>
+            </w:tcMar>
+          </w:tcPr>
+          <w:p>
+            <w:pPr>
+              <w:spacing w:after="20" w:line="240" w:lineRule="auto"/>
+            </w:pPr>
+            <w:r>
+              <w:rPr>
+                <w:b w:val="0"/>
+                <w:color w:val="000000"/>
+                <w:sz w:val="19"/>
+              </w:rPr>
+            </w:r>
+          </w:p>
+        </w:tc>
+        <w:tc>
+          <w:tcPr>
+            <w:tcW w:type="dxa" w:w="1827"/>
+            <w:shd w:fill="F1F5F7"/>
+            <w:tcBorders>
+              <w:top w:val="single" w:sz="4" w:color="D9D9D9"/>
+              <w:bottom w:val="single" w:sz="4" w:color="D9D9D9"/>
+              <w:left w:val="single" w:sz="4" w:color="D9D9D9"/>
+              <w:right w:val="single" w:sz="4" w:color="D9D9D9"/>
+            </w:tcBorders>
+            <w:tcMar>
+              <w:top w:w="85" w:type="dxa"/>
+              <w:bottom w:w="85" w:type="dxa"/>
+              <w:left w:w="85" w:type="dxa"/>
+              <w:right w:w="85" w:type="dxa"/>
+            </w:tcMar>
+          </w:tcPr>
+          <w:p>
+            <w:pPr>
+              <w:spacing w:after="20" w:line="240" w:lineRule="auto"/>
+            </w:pPr>
+            <w:r>
+              <w:rPr>
+                <w:b w:val="0"/>
+                <w:color w:val="000000"/>
+                <w:sz w:val="19"/>
+              </w:rPr>
+            </w:r>
+          </w:p>
+        </w:tc>
+      </w:tr>
+      <w:tr>
+        <w:tc>
+          <w:tcPr>
+            <w:tcW w:type="dxa" w:w="6497"/>
+            <w:shd w:fill="FFFFFF"/>
+            <w:tcBorders>
+              <w:top w:val="single" w:sz="4" w:color="D9D9D9"/>
+              <w:bottom w:val="single" w:sz="4" w:color="D9D9D9"/>
+              <w:left w:val="single" w:sz="4" w:color="D9D9D9"/>
+              <w:right w:val="single" w:sz="4" w:color="D9D9D9"/>
+            </w:tcBorders>
+            <w:tcMar>
+              <w:top w:w="85" w:type="dxa"/>
+              <w:bottom w:w="85" w:type="dxa"/>
+              <w:left w:w="85" w:type="dxa"/>
+              <w:right w:w="85" w:type="dxa"/>
+            </w:tcMar>
+          </w:tcPr>
+          <w:p>
+            <w:pPr>
+              <w:spacing w:after="20" w:line="240" w:lineRule="auto"/>
+            </w:pPr>
+            <w:r>
+              <w:rPr>
+                <w:b w:val="0"/>
+                <w:color w:val="000000"/>
+                <w:sz w:val="19"/>
+              </w:rPr>
+              <w:t>(iii) GDP divided by the population</w:t>
+            </w:r>
+          </w:p>
+        </w:tc>
+        <w:tc>
+          <w:tcPr>
+            <w:tcW w:type="dxa" w:w="1827"/>
+            <w:shd w:fill="FFFFFF"/>
+            <w:tcBorders>
+              <w:top w:val="single" w:sz="4" w:color="D9D9D9"/>
+              <w:bottom w:val="single" w:sz="4" w:color="D9D9D9"/>
+              <w:left w:val="single" w:sz="4" w:color="D9D9D9"/>
+              <w:right w:val="single" w:sz="4" w:color="D9D9D9"/>
+            </w:tcBorders>
+            <w:tcMar>
+              <w:top w:w="85" w:type="dxa"/>
+              <w:bottom w:w="85" w:type="dxa"/>
+              <w:left w:w="85" w:type="dxa"/>
+              <w:right w:w="85" w:type="dxa"/>
+            </w:tcMar>
+          </w:tcPr>
+          <w:p>
+            <w:pPr>
+              <w:spacing w:after="20" w:line="240" w:lineRule="auto"/>
+            </w:pPr>
+            <w:r>
+              <w:rPr>
+                <w:b w:val="0"/>
+                <w:color w:val="000000"/>
+                <w:sz w:val="19"/>
+              </w:rPr>
+            </w:r>
+          </w:p>
+        </w:tc>
+        <w:tc>
+          <w:tcPr>
+            <w:tcW w:type="dxa" w:w="1827"/>
+            <w:shd w:fill="FFFFFF"/>
+            <w:tcBorders>
+              <w:top w:val="single" w:sz="4" w:color="D9D9D9"/>
+              <w:bottom w:val="single" w:sz="4" w:color="D9D9D9"/>
+              <w:left w:val="single" w:sz="4" w:color="D9D9D9"/>
+              <w:right w:val="single" w:sz="4" w:color="D9D9D9"/>
+            </w:tcBorders>
+            <w:tcMar>
+              <w:top w:w="85" w:type="dxa"/>
+              <w:bottom w:w="85" w:type="dxa"/>
+              <w:left w:w="85" w:type="dxa"/>
+              <w:right w:w="85" w:type="dxa"/>
+            </w:tcMar>
+          </w:tcPr>
+          <w:p>
+            <w:pPr>
+              <w:spacing w:after="20" w:line="240" w:lineRule="auto"/>
+            </w:pPr>
+            <w:r>
+              <w:rPr>
+                <w:b w:val="0"/>
+                <w:color w:val="000000"/>
+                <w:sz w:val="19"/>
+              </w:rPr>
+            </w:r>
+          </w:p>
+        </w:tc>
+      </w:tr>
+      <w:tr>
+        <w:tc>
+          <w:tcPr>
+            <w:tcW w:type="dxa" w:w="6497"/>
+            <w:shd w:fill="F1F5F7"/>
+            <w:tcBorders>
+              <w:top w:val="single" w:sz="4" w:color="D9D9D9"/>
+              <w:bottom w:val="single" w:sz="4" w:color="D9D9D9"/>
+              <w:left w:val="single" w:sz="4" w:color="D9D9D9"/>
+              <w:right w:val="single" w:sz="4" w:color="D9D9D9"/>
+            </w:tcBorders>
+            <w:tcMar>
+              <w:top w:w="85" w:type="dxa"/>
+              <w:bottom w:w="85" w:type="dxa"/>
+              <w:left w:w="85" w:type="dxa"/>
+              <w:right w:w="85" w:type="dxa"/>
+            </w:tcMar>
+          </w:tcPr>
+          <w:p>
+            <w:pPr>
+              <w:spacing w:after="20" w:line="240" w:lineRule="auto"/>
+            </w:pPr>
+            <w:r>
+              <w:rPr>
+                <w:b w:val="0"/>
+                <w:color w:val="000000"/>
+                <w:sz w:val="19"/>
+              </w:rPr>
+              <w:t>(iv) the figure whose rate of change is normally used as the measure of economic growth</w:t>
+            </w:r>
+          </w:p>
+        </w:tc>
+        <w:tc>
+          <w:tcPr>
+            <w:tcW w:type="dxa" w:w="1827"/>
+            <w:shd w:fill="F1F5F7"/>
+            <w:tcBorders>
+              <w:top w:val="single" w:sz="4" w:color="D9D9D9"/>
+              <w:bottom w:val="single" w:sz="4" w:color="D9D9D9"/>
+              <w:left w:val="single" w:sz="4" w:color="D9D9D9"/>
+              <w:right w:val="single" w:sz="4" w:color="D9D9D9"/>
+            </w:tcBorders>
+            <w:tcMar>
+              <w:top w:w="85" w:type="dxa"/>
+              <w:bottom w:w="85" w:type="dxa"/>
+              <w:left w:w="85" w:type="dxa"/>
+              <w:right w:w="85" w:type="dxa"/>
+            </w:tcMar>
+          </w:tcPr>
+          <w:p>
+            <w:pPr>
+              <w:spacing w:after="20" w:line="240" w:lineRule="auto"/>
+            </w:pPr>
+            <w:r>
+              <w:rPr>
+                <w:b w:val="0"/>
+                <w:color w:val="000000"/>
+                <w:sz w:val="19"/>
+              </w:rPr>
+            </w:r>
+          </w:p>
+        </w:tc>
+        <w:tc>
+          <w:tcPr>
+            <w:tcW w:type="dxa" w:w="1827"/>
+            <w:shd w:fill="F1F5F7"/>
+            <w:tcBorders>
+              <w:top w:val="single" w:sz="4" w:color="D9D9D9"/>
+              <w:bottom w:val="single" w:sz="4" w:color="D9D9D9"/>
+              <w:left w:val="single" w:sz="4" w:color="D9D9D9"/>
+              <w:right w:val="single" w:sz="4" w:color="D9D9D9"/>
+            </w:tcBorders>
+            <w:tcMar>
+              <w:top w:w="85" w:type="dxa"/>
+              <w:bottom w:w="85" w:type="dxa"/>
+              <w:left w:w="85" w:type="dxa"/>
+              <w:right w:w="85" w:type="dxa"/>
+            </w:tcMar>
+          </w:tcPr>
+          <w:p>
+            <w:pPr>
+              <w:spacing w:after="20" w:line="240" w:lineRule="auto"/>
+            </w:pPr>
+            <w:r>
+              <w:rPr>
+                <w:b w:val="0"/>
+                <w:color w:val="000000"/>
+                <w:sz w:val="19"/>
+              </w:rPr>
+            </w:r>
+          </w:p>
+        </w:tc>
+      </w:tr>
+    </w:tbl>
+    <w:p>
+      <w:pPr>
+        <w:spacing w:after="20"/>
+      </w:pPr>
     </w:p>
     <w:p>
       <w:r>
@@ -762,16 +1246,16 @@
         <w:tblLook w:firstColumn="1" w:firstRow="1" w:lastColumn="0" w:lastRow="0" w:noHBand="0" w:noVBand="1" w:val="04A0"/>
       </w:tblPr>
       <w:tblGrid>
-        <w:gridCol w:w="3889"/>
-        <w:gridCol w:w="1650"/>
-        <w:gridCol w:w="1650"/>
-        <w:gridCol w:w="1650"/>
-        <w:gridCol w:w="1650"/>
+        <w:gridCol w:w="3756"/>
+        <w:gridCol w:w="1594"/>
+        <w:gridCol w:w="1594"/>
+        <w:gridCol w:w="1594"/>
+        <w:gridCol w:w="1594"/>
       </w:tblGrid>
       <w:tr>
         <w:tc>
           <w:tcPr>
-            <w:tcW w:type="dxa" w:w="3889"/>
+            <w:tcW w:type="dxa" w:w="3756"/>
             <w:shd w:fill="142D40"/>
             <w:tcBorders>
               <w:top w:val="single" w:sz="4" w:color="D9D9D9"/>
@@ -802,7 +1286,7 @@
         </w:tc>
         <w:tc>
           <w:tcPr>
-            <w:tcW w:type="dxa" w:w="1650"/>
+            <w:tcW w:type="dxa" w:w="1594"/>
             <w:shd w:fill="142D40"/>
             <w:tcBorders>
               <w:top w:val="single" w:sz="4" w:color="D9D9D9"/>
@@ -833,7 +1317,7 @@
         </w:tc>
         <w:tc>
           <w:tcPr>
-            <w:tcW w:type="dxa" w:w="1650"/>
+            <w:tcW w:type="dxa" w:w="1594"/>
             <w:shd w:fill="142D40"/>
             <w:tcBorders>
               <w:top w:val="single" w:sz="4" w:color="D9D9D9"/>
@@ -864,7 +1348,7 @@
         </w:tc>
         <w:tc>
           <w:tcPr>
-            <w:tcW w:type="dxa" w:w="1650"/>
+            <w:tcW w:type="dxa" w:w="1594"/>
             <w:shd w:fill="142D40"/>
             <w:tcBorders>
               <w:top w:val="single" w:sz="4" w:color="D9D9D9"/>
@@ -895,7 +1379,7 @@
         </w:tc>
         <w:tc>
           <w:tcPr>
-            <w:tcW w:type="dxa" w:w="1650"/>
+            <w:tcW w:type="dxa" w:w="1594"/>
             <w:shd w:fill="142D40"/>
             <w:tcBorders>
               <w:top w:val="single" w:sz="4" w:color="D9D9D9"/>
@@ -928,7 +1412,7 @@
       <w:tr>
         <w:tc>
           <w:tcPr>
-            <w:tcW w:type="dxa" w:w="3889"/>
+            <w:tcW w:type="dxa" w:w="3756"/>
             <w:shd w:fill="FFFFFF"/>
             <w:tcBorders>
               <w:top w:val="single" w:sz="4" w:color="D9D9D9"/>
@@ -959,7 +1443,7 @@
         </w:tc>
         <w:tc>
           <w:tcPr>
-            <w:tcW w:type="dxa" w:w="1650"/>
+            <w:tcW w:type="dxa" w:w="1594"/>
             <w:shd w:fill="FFFFFF"/>
             <w:tcBorders>
               <w:top w:val="single" w:sz="4" w:color="D9D9D9"/>
@@ -990,7 +1474,7 @@
         </w:tc>
         <w:tc>
           <w:tcPr>
-            <w:tcW w:type="dxa" w:w="1650"/>
+            <w:tcW w:type="dxa" w:w="1594"/>
             <w:shd w:fill="FFFFFF"/>
             <w:tcBorders>
               <w:top w:val="single" w:sz="4" w:color="D9D9D9"/>
@@ -1020,7 +1504,7 @@
         </w:tc>
         <w:tc>
           <w:tcPr>
-            <w:tcW w:type="dxa" w:w="1650"/>
+            <w:tcW w:type="dxa" w:w="1594"/>
             <w:shd w:fill="FFFFFF"/>
             <w:tcBorders>
               <w:top w:val="single" w:sz="4" w:color="D9D9D9"/>
@@ -1050,7 +1534,7 @@
         </w:tc>
         <w:tc>
           <w:tcPr>
-            <w:tcW w:type="dxa" w:w="1650"/>
+            <w:tcW w:type="dxa" w:w="1594"/>
             <w:shd w:fill="FFFFFF"/>
             <w:tcBorders>
               <w:top w:val="single" w:sz="4" w:color="D9D9D9"/>
@@ -1092,15 +1576,26 @@
     </w:p>
     <w:p>
       <w:pPr>
-        <w:spacing w:after="40"/>
+        <w:pBdr>
+          <w:bottom w:val="single" w:sz="4" w:space="1" w:color="CDD3D9"/>
+          <w:between w:val="single" w:sz="4" w:space="1" w:color="CDD3D9"/>
+        </w:pBdr>
+        <w:spacing w:before="0" w:after="0" w:line="500" w:lineRule="exact"/>
       </w:pPr>
-      <w:r>
-        <w:rPr>
-          <w:color w:val="CDD3D9"/>
-          <w:sz w:val="18"/>
-        </w:rPr>
-        <w:t>________________________________________________________________________________</w:t>
-      </w:r>
+    </w:p>
+    <w:p>
+      <w:pPr>
+        <w:pBdr>
+          <w:bottom w:val="single" w:sz="4" w:space="1" w:color="CDD3D9"/>
+          <w:between w:val="single" w:sz="4" w:space="1" w:color="CDD3D9"/>
+        </w:pBdr>
+        <w:spacing w:before="0" w:after="0" w:line="500" w:lineRule="exact"/>
+      </w:pPr>
+    </w:p>
+    <w:p>
+      <w:pPr>
+        <w:spacing w:after="0" w:line="140" w:lineRule="exact"/>
+      </w:pPr>
     </w:p>
     <w:p>
       <w:pPr>
@@ -1122,15 +1617,15 @@
         <w:tblLook w:firstColumn="1" w:firstRow="1" w:lastColumn="0" w:lastRow="0" w:noHBand="0" w:noVBand="1" w:val="04A0"/>
       </w:tblPr>
       <w:tblGrid>
-        <w:gridCol w:w="3889"/>
-        <w:gridCol w:w="2208"/>
-        <w:gridCol w:w="2208"/>
-        <w:gridCol w:w="2208"/>
+        <w:gridCol w:w="3756"/>
+        <w:gridCol w:w="2132"/>
+        <w:gridCol w:w="2132"/>
+        <w:gridCol w:w="2132"/>
       </w:tblGrid>
       <w:tr>
         <w:tc>
           <w:tcPr>
-            <w:tcW w:type="dxa" w:w="3889"/>
+            <w:tcW w:type="dxa" w:w="3756"/>
             <w:shd w:fill="142D40"/>
             <w:tcBorders>
               <w:top w:val="single" w:sz="4" w:color="D9D9D9"/>
@@ -1161,7 +1656,7 @@
         </w:tc>
         <w:tc>
           <w:tcPr>
-            <w:tcW w:type="dxa" w:w="2208"/>
+            <w:tcW w:type="dxa" w:w="2132"/>
             <w:shd w:fill="142D40"/>
             <w:tcBorders>
               <w:top w:val="single" w:sz="4" w:color="D9D9D9"/>
@@ -1192,7 +1687,7 @@
         </w:tc>
         <w:tc>
           <w:tcPr>
-            <w:tcW w:type="dxa" w:w="2208"/>
+            <w:tcW w:type="dxa" w:w="2132"/>
             <w:shd w:fill="142D40"/>
             <w:tcBorders>
               <w:top w:val="single" w:sz="4" w:color="D9D9D9"/>
@@ -1223,7 +1718,7 @@
         </w:tc>
         <w:tc>
           <w:tcPr>
-            <w:tcW w:type="dxa" w:w="2208"/>
+            <w:tcW w:type="dxa" w:w="2132"/>
             <w:shd w:fill="142D40"/>
             <w:tcBorders>
               <w:top w:val="single" w:sz="4" w:color="D9D9D9"/>
@@ -1256,7 +1751,7 @@
       <w:tr>
         <w:tc>
           <w:tcPr>
-            <w:tcW w:type="dxa" w:w="3889"/>
+            <w:tcW w:type="dxa" w:w="3756"/>
             <w:shd w:fill="FFFFFF"/>
             <w:tcBorders>
               <w:top w:val="single" w:sz="4" w:color="D9D9D9"/>
@@ -1287,7 +1782,7 @@
         </w:tc>
         <w:tc>
           <w:tcPr>
-            <w:tcW w:type="dxa" w:w="2208"/>
+            <w:tcW w:type="dxa" w:w="2132"/>
             <w:shd w:fill="FFFFFF"/>
             <w:tcBorders>
               <w:top w:val="single" w:sz="4" w:color="D9D9D9"/>
@@ -1317,7 +1812,7 @@
         </w:tc>
         <w:tc>
           <w:tcPr>
-            <w:tcW w:type="dxa" w:w="2208"/>
+            <w:tcW w:type="dxa" w:w="2132"/>
             <w:shd w:fill="FFFFFF"/>
             <w:tcBorders>
               <w:top w:val="single" w:sz="4" w:color="D9D9D9"/>
@@ -1347,7 +1842,7 @@
         </w:tc>
         <w:tc>
           <w:tcPr>
-            <w:tcW w:type="dxa" w:w="2208"/>
+            <w:tcW w:type="dxa" w:w="2132"/>
             <w:shd w:fill="FFFFFF"/>
             <w:tcBorders>
               <w:top w:val="single" w:sz="4" w:color="D9D9D9"/>
@@ -1379,7 +1874,7 @@
       <w:tr>
         <w:tc>
           <w:tcPr>
-            <w:tcW w:type="dxa" w:w="3889"/>
+            <w:tcW w:type="dxa" w:w="3756"/>
             <w:shd w:fill="F1F5F7"/>
             <w:tcBorders>
               <w:top w:val="single" w:sz="4" w:color="D9D9D9"/>
@@ -1410,7 +1905,7 @@
         </w:tc>
         <w:tc>
           <w:tcPr>
-            <w:tcW w:type="dxa" w:w="2208"/>
+            <w:tcW w:type="dxa" w:w="2132"/>
             <w:shd w:fill="F1F5F7"/>
             <w:tcBorders>
               <w:top w:val="single" w:sz="4" w:color="D9D9D9"/>
@@ -1440,7 +1935,7 @@
         </w:tc>
         <w:tc>
           <w:tcPr>
-            <w:tcW w:type="dxa" w:w="2208"/>
+            <w:tcW w:type="dxa" w:w="2132"/>
             <w:shd w:fill="F1F5F7"/>
             <w:tcBorders>
               <w:top w:val="single" w:sz="4" w:color="D9D9D9"/>
@@ -1470,7 +1965,7 @@
         </w:tc>
         <w:tc>
           <w:tcPr>
-            <w:tcW w:type="dxa" w:w="2208"/>
+            <w:tcW w:type="dxa" w:w="2132"/>
             <w:shd w:fill="F1F5F7"/>
             <w:tcBorders>
               <w:top w:val="single" w:sz="4" w:color="D9D9D9"/>
@@ -1502,7 +1997,7 @@
       <w:tr>
         <w:tc>
           <w:tcPr>
-            <w:tcW w:type="dxa" w:w="3889"/>
+            <w:tcW w:type="dxa" w:w="3756"/>
             <w:shd w:fill="FFFFFF"/>
             <w:tcBorders>
               <w:top w:val="single" w:sz="4" w:color="D9D9D9"/>
@@ -1533,7 +2028,7 @@
         </w:tc>
         <w:tc>
           <w:tcPr>
-            <w:tcW w:type="dxa" w:w="2208"/>
+            <w:tcW w:type="dxa" w:w="2132"/>
             <w:shd w:fill="FFFFFF"/>
             <w:tcBorders>
               <w:top w:val="single" w:sz="4" w:color="D9D9D9"/>
@@ -1563,7 +2058,7 @@
         </w:tc>
         <w:tc>
           <w:tcPr>
-            <w:tcW w:type="dxa" w:w="2208"/>
+            <w:tcW w:type="dxa" w:w="2132"/>
             <w:shd w:fill="FFFFFF"/>
             <w:tcBorders>
               <w:top w:val="single" w:sz="4" w:color="D9D9D9"/>
@@ -1593,7 +2088,7 @@
         </w:tc>
         <w:tc>
           <w:tcPr>
-            <w:tcW w:type="dxa" w:w="2208"/>
+            <w:tcW w:type="dxa" w:w="2132"/>
             <w:shd w:fill="FFFFFF"/>
             <w:tcBorders>
               <w:top w:val="single" w:sz="4" w:color="D9D9D9"/>
@@ -1630,44 +2125,95 @@
     </w:p>
     <w:p>
       <w:r>
+        <w:t>Working space:</w:t>
+      </w:r>
+    </w:p>
+    <w:p>
+      <w:pPr>
+        <w:pBdr>
+          <w:bottom w:val="single" w:sz="4" w:space="1" w:color="CDD3D9"/>
+          <w:between w:val="single" w:sz="4" w:space="1" w:color="CDD3D9"/>
+        </w:pBdr>
+        <w:spacing w:before="0" w:after="0" w:line="500" w:lineRule="exact"/>
+      </w:pPr>
+    </w:p>
+    <w:p>
+      <w:pPr>
+        <w:pBdr>
+          <w:bottom w:val="single" w:sz="4" w:space="1" w:color="CDD3D9"/>
+          <w:between w:val="single" w:sz="4" w:space="1" w:color="CDD3D9"/>
+        </w:pBdr>
+        <w:spacing w:before="0" w:after="0" w:line="500" w:lineRule="exact"/>
+      </w:pPr>
+    </w:p>
+    <w:p>
+      <w:pPr>
+        <w:pBdr>
+          <w:bottom w:val="single" w:sz="4" w:space="1" w:color="CDD3D9"/>
+          <w:between w:val="single" w:sz="4" w:space="1" w:color="CDD3D9"/>
+        </w:pBdr>
+        <w:spacing w:before="0" w:after="0" w:line="500" w:lineRule="exact"/>
+      </w:pPr>
+    </w:p>
+    <w:p>
+      <w:pPr>
+        <w:pBdr>
+          <w:bottom w:val="single" w:sz="4" w:space="1" w:color="CDD3D9"/>
+          <w:between w:val="single" w:sz="4" w:space="1" w:color="CDD3D9"/>
+        </w:pBdr>
+        <w:spacing w:before="0" w:after="0" w:line="500" w:lineRule="exact"/>
+      </w:pPr>
+    </w:p>
+    <w:p>
+      <w:pPr>
+        <w:spacing w:after="0" w:line="140" w:lineRule="exact"/>
+      </w:pPr>
+    </w:p>
+    <w:p>
+      <w:r>
         <w:t>a. In each year, which is larger, nominal growth or real growth? Explain the gap using the price index.</w:t>
       </w:r>
     </w:p>
     <w:p>
       <w:pPr>
-        <w:spacing w:after="40"/>
+        <w:pBdr>
+          <w:bottom w:val="single" w:sz="4" w:space="1" w:color="CDD3D9"/>
+          <w:between w:val="single" w:sz="4" w:space="1" w:color="CDD3D9"/>
+        </w:pBdr>
+        <w:spacing w:before="0" w:after="0" w:line="500" w:lineRule="exact"/>
       </w:pPr>
-      <w:r>
-        <w:rPr>
-          <w:color w:val="CDD3D9"/>
-          <w:sz w:val="18"/>
-        </w:rPr>
-        <w:t>________________________________________________________________________________</w:t>
-      </w:r>
     </w:p>
     <w:p>
       <w:pPr>
-        <w:spacing w:after="40"/>
+        <w:pBdr>
+          <w:bottom w:val="single" w:sz="4" w:space="1" w:color="CDD3D9"/>
+          <w:between w:val="single" w:sz="4" w:space="1" w:color="CDD3D9"/>
+        </w:pBdr>
+        <w:spacing w:before="0" w:after="0" w:line="500" w:lineRule="exact"/>
       </w:pPr>
-      <w:r>
-        <w:rPr>
-          <w:color w:val="CDD3D9"/>
-          <w:sz w:val="18"/>
-        </w:rPr>
-        <w:t>________________________________________________________________________________</w:t>
-      </w:r>
     </w:p>
     <w:p>
       <w:pPr>
-        <w:spacing w:after="40"/>
+        <w:pBdr>
+          <w:bottom w:val="single" w:sz="4" w:space="1" w:color="CDD3D9"/>
+          <w:between w:val="single" w:sz="4" w:space="1" w:color="CDD3D9"/>
+        </w:pBdr>
+        <w:spacing w:before="0" w:after="0" w:line="500" w:lineRule="exact"/>
       </w:pPr>
-      <w:r>
-        <w:rPr>
-          <w:color w:val="CDD3D9"/>
-          <w:sz w:val="18"/>
-        </w:rPr>
-        <w:t>________________________________________________________________________________</w:t>
-      </w:r>
+    </w:p>
+    <w:p>
+      <w:pPr>
+        <w:pBdr>
+          <w:bottom w:val="single" w:sz="4" w:space="1" w:color="CDD3D9"/>
+          <w:between w:val="single" w:sz="4" w:space="1" w:color="CDD3D9"/>
+        </w:pBdr>
+        <w:spacing w:before="0" w:after="0" w:line="500" w:lineRule="exact"/>
+      </w:pPr>
+    </w:p>
+    <w:p>
+      <w:pPr>
+        <w:spacing w:after="0" w:line="140" w:lineRule="exact"/>
+      </w:pPr>
     </w:p>
     <w:p>
       <w:r>
@@ -1676,27 +2222,35 @@
     </w:p>
     <w:p>
       <w:pPr>
-        <w:spacing w:after="40"/>
+        <w:pBdr>
+          <w:bottom w:val="single" w:sz="4" w:space="1" w:color="CDD3D9"/>
+          <w:between w:val="single" w:sz="4" w:space="1" w:color="CDD3D9"/>
+        </w:pBdr>
+        <w:spacing w:before="0" w:after="0" w:line="500" w:lineRule="exact"/>
       </w:pPr>
-      <w:r>
-        <w:rPr>
-          <w:color w:val="CDD3D9"/>
-          <w:sz w:val="18"/>
-        </w:rPr>
-        <w:t>________________________________________________________________________________</w:t>
-      </w:r>
     </w:p>
     <w:p>
       <w:pPr>
-        <w:spacing w:after="40"/>
+        <w:pBdr>
+          <w:bottom w:val="single" w:sz="4" w:space="1" w:color="CDD3D9"/>
+          <w:between w:val="single" w:sz="4" w:space="1" w:color="CDD3D9"/>
+        </w:pBdr>
+        <w:spacing w:before="0" w:after="0" w:line="500" w:lineRule="exact"/>
       </w:pPr>
-      <w:r>
-        <w:rPr>
-          <w:color w:val="CDD3D9"/>
-          <w:sz w:val="18"/>
-        </w:rPr>
-        <w:t>________________________________________________________________________________</w:t>
-      </w:r>
+    </w:p>
+    <w:p>
+      <w:pPr>
+        <w:pBdr>
+          <w:bottom w:val="single" w:sz="4" w:space="1" w:color="CDD3D9"/>
+          <w:between w:val="single" w:sz="4" w:space="1" w:color="CDD3D9"/>
+        </w:pBdr>
+        <w:spacing w:before="0" w:after="0" w:line="500" w:lineRule="exact"/>
+      </w:pPr>
+    </w:p>
+    <w:p>
+      <w:pPr>
+        <w:spacing w:after="0" w:line="140" w:lineRule="exact"/>
+      </w:pPr>
     </w:p>
     <w:p>
       <w:r>
@@ -1723,39 +2277,44 @@
     </w:p>
     <w:p>
       <w:pPr>
-        <w:spacing w:after="40"/>
+        <w:pBdr>
+          <w:bottom w:val="single" w:sz="4" w:space="1" w:color="CDD3D9"/>
+          <w:between w:val="single" w:sz="4" w:space="1" w:color="CDD3D9"/>
+        </w:pBdr>
+        <w:spacing w:before="0" w:after="0" w:line="500" w:lineRule="exact"/>
       </w:pPr>
-      <w:r>
-        <w:rPr>
-          <w:color w:val="CDD3D9"/>
-          <w:sz w:val="18"/>
-        </w:rPr>
-        <w:t>________________________________________________________________________________</w:t>
-      </w:r>
     </w:p>
     <w:p>
       <w:pPr>
-        <w:spacing w:after="40"/>
+        <w:pBdr>
+          <w:bottom w:val="single" w:sz="4" w:space="1" w:color="CDD3D9"/>
+          <w:between w:val="single" w:sz="4" w:space="1" w:color="CDD3D9"/>
+        </w:pBdr>
+        <w:spacing w:before="0" w:after="0" w:line="500" w:lineRule="exact"/>
       </w:pPr>
-      <w:r>
-        <w:rPr>
-          <w:color w:val="CDD3D9"/>
-          <w:sz w:val="18"/>
-        </w:rPr>
-        <w:t>________________________________________________________________________________</w:t>
-      </w:r>
     </w:p>
     <w:p>
       <w:pPr>
-        <w:spacing w:after="40"/>
+        <w:pBdr>
+          <w:bottom w:val="single" w:sz="4" w:space="1" w:color="CDD3D9"/>
+          <w:between w:val="single" w:sz="4" w:space="1" w:color="CDD3D9"/>
+        </w:pBdr>
+        <w:spacing w:before="0" w:after="0" w:line="500" w:lineRule="exact"/>
       </w:pPr>
-      <w:r>
-        <w:rPr>
-          <w:color w:val="CDD3D9"/>
-          <w:sz w:val="18"/>
-        </w:rPr>
-        <w:t>________________________________________________________________________________</w:t>
-      </w:r>
+    </w:p>
+    <w:p>
+      <w:pPr>
+        <w:pBdr>
+          <w:bottom w:val="single" w:sz="4" w:space="1" w:color="CDD3D9"/>
+          <w:between w:val="single" w:sz="4" w:space="1" w:color="CDD3D9"/>
+        </w:pBdr>
+        <w:spacing w:before="0" w:after="0" w:line="500" w:lineRule="exact"/>
+      </w:pPr>
+    </w:p>
+    <w:p>
+      <w:pPr>
+        <w:spacing w:after="0" w:line="140" w:lineRule="exact"/>
+      </w:pPr>
     </w:p>
     <w:p>
       <w:r>
@@ -1764,27 +2323,26 @@
     </w:p>
     <w:p>
       <w:pPr>
-        <w:spacing w:after="40"/>
+        <w:pBdr>
+          <w:bottom w:val="single" w:sz="4" w:space="1" w:color="CDD3D9"/>
+          <w:between w:val="single" w:sz="4" w:space="1" w:color="CDD3D9"/>
+        </w:pBdr>
+        <w:spacing w:before="0" w:after="0" w:line="500" w:lineRule="exact"/>
       </w:pPr>
-      <w:r>
-        <w:rPr>
-          <w:color w:val="CDD3D9"/>
-          <w:sz w:val="18"/>
-        </w:rPr>
-        <w:t>________________________________________________________________________________</w:t>
-      </w:r>
     </w:p>
     <w:p>
       <w:pPr>
-        <w:spacing w:after="40"/>
+        <w:pBdr>
+          <w:bottom w:val="single" w:sz="4" w:space="1" w:color="CDD3D9"/>
+          <w:between w:val="single" w:sz="4" w:space="1" w:color="CDD3D9"/>
+        </w:pBdr>
+        <w:spacing w:before="0" w:after="0" w:line="500" w:lineRule="exact"/>
       </w:pPr>
-      <w:r>
-        <w:rPr>
-          <w:color w:val="CDD3D9"/>
-          <w:sz w:val="18"/>
-        </w:rPr>
-        <w:t>________________________________________________________________________________</w:t>
-      </w:r>
+    </w:p>
+    <w:p>
+      <w:pPr>
+        <w:spacing w:after="0" w:line="140" w:lineRule="exact"/>
+      </w:pPr>
     </w:p>
     <w:p>
       <w:pPr>
@@ -1806,15 +2364,15 @@
         <w:tblLook w:firstColumn="1" w:firstRow="1" w:lastColumn="0" w:lastRow="0" w:noHBand="0" w:noVBand="1" w:val="04A0"/>
       </w:tblPr>
       <w:tblGrid>
-        <w:gridCol w:w="3889"/>
-        <w:gridCol w:w="2208"/>
-        <w:gridCol w:w="2208"/>
-        <w:gridCol w:w="2208"/>
+        <w:gridCol w:w="3756"/>
+        <w:gridCol w:w="2132"/>
+        <w:gridCol w:w="2132"/>
+        <w:gridCol w:w="2132"/>
       </w:tblGrid>
       <w:tr>
         <w:tc>
           <w:tcPr>
-            <w:tcW w:type="dxa" w:w="3889"/>
+            <w:tcW w:type="dxa" w:w="3756"/>
             <w:shd w:fill="142D40"/>
             <w:tcBorders>
               <w:top w:val="single" w:sz="4" w:color="D9D9D9"/>
@@ -1844,7 +2402,7 @@
         </w:tc>
         <w:tc>
           <w:tcPr>
-            <w:tcW w:type="dxa" w:w="2208"/>
+            <w:tcW w:type="dxa" w:w="2132"/>
             <w:shd w:fill="142D40"/>
             <w:tcBorders>
               <w:top w:val="single" w:sz="4" w:color="D9D9D9"/>
@@ -1875,7 +2433,7 @@
         </w:tc>
         <w:tc>
           <w:tcPr>
-            <w:tcW w:type="dxa" w:w="2208"/>
+            <w:tcW w:type="dxa" w:w="2132"/>
             <w:shd w:fill="142D40"/>
             <w:tcBorders>
               <w:top w:val="single" w:sz="4" w:color="D9D9D9"/>
@@ -1906,7 +2464,7 @@
         </w:tc>
         <w:tc>
           <w:tcPr>
-            <w:tcW w:type="dxa" w:w="2208"/>
+            <w:tcW w:type="dxa" w:w="2132"/>
             <w:shd w:fill="142D40"/>
             <w:tcBorders>
               <w:top w:val="single" w:sz="4" w:color="D9D9D9"/>
@@ -1939,7 +2497,7 @@
       <w:tr>
         <w:tc>
           <w:tcPr>
-            <w:tcW w:type="dxa" w:w="3889"/>
+            <w:tcW w:type="dxa" w:w="3756"/>
             <w:shd w:fill="FFFFFF"/>
             <w:tcBorders>
               <w:top w:val="single" w:sz="4" w:color="D9D9D9"/>
@@ -1970,7 +2528,7 @@
         </w:tc>
         <w:tc>
           <w:tcPr>
-            <w:tcW w:type="dxa" w:w="2208"/>
+            <w:tcW w:type="dxa" w:w="2132"/>
             <w:shd w:fill="FFFFFF"/>
             <w:tcBorders>
               <w:top w:val="single" w:sz="4" w:color="D9D9D9"/>
@@ -2000,7 +2558,7 @@
         </w:tc>
         <w:tc>
           <w:tcPr>
-            <w:tcW w:type="dxa" w:w="2208"/>
+            <w:tcW w:type="dxa" w:w="2132"/>
             <w:shd w:fill="FFFFFF"/>
             <w:tcBorders>
               <w:top w:val="single" w:sz="4" w:color="D9D9D9"/>
@@ -2030,7 +2588,7 @@
         </w:tc>
         <w:tc>
           <w:tcPr>
-            <w:tcW w:type="dxa" w:w="2208"/>
+            <w:tcW w:type="dxa" w:w="2132"/>
             <w:shd w:fill="FFFFFF"/>
             <w:tcBorders>
               <w:top w:val="single" w:sz="4" w:color="D9D9D9"/>
@@ -2067,27 +2625,35 @@
     </w:p>
     <w:p>
       <w:pPr>
-        <w:spacing w:after="40"/>
+        <w:pBdr>
+          <w:bottom w:val="single" w:sz="4" w:space="1" w:color="CDD3D9"/>
+          <w:between w:val="single" w:sz="4" w:space="1" w:color="CDD3D9"/>
+        </w:pBdr>
+        <w:spacing w:before="0" w:after="0" w:line="500" w:lineRule="exact"/>
       </w:pPr>
-      <w:r>
-        <w:rPr>
-          <w:color w:val="CDD3D9"/>
-          <w:sz w:val="18"/>
-        </w:rPr>
-        <w:t>________________________________________________________________________________</w:t>
-      </w:r>
     </w:p>
     <w:p>
       <w:pPr>
-        <w:spacing w:after="40"/>
+        <w:pBdr>
+          <w:bottom w:val="single" w:sz="4" w:space="1" w:color="CDD3D9"/>
+          <w:between w:val="single" w:sz="4" w:space="1" w:color="CDD3D9"/>
+        </w:pBdr>
+        <w:spacing w:before="0" w:after="0" w:line="500" w:lineRule="exact"/>
       </w:pPr>
-      <w:r>
-        <w:rPr>
-          <w:color w:val="CDD3D9"/>
-          <w:sz w:val="18"/>
-        </w:rPr>
-        <w:t>________________________________________________________________________________</w:t>
-      </w:r>
+    </w:p>
+    <w:p>
+      <w:pPr>
+        <w:pBdr>
+          <w:bottom w:val="single" w:sz="4" w:space="1" w:color="CDD3D9"/>
+          <w:between w:val="single" w:sz="4" w:space="1" w:color="CDD3D9"/>
+        </w:pBdr>
+        <w:spacing w:before="0" w:after="0" w:line="500" w:lineRule="exact"/>
+      </w:pPr>
+    </w:p>
+    <w:p>
+      <w:pPr>
+        <w:spacing w:after="0" w:line="140" w:lineRule="exact"/>
+      </w:pPr>
     </w:p>
     <w:p>
       <w:r>
@@ -2096,27 +2662,35 @@
     </w:p>
     <w:p>
       <w:pPr>
-        <w:spacing w:after="40"/>
+        <w:pBdr>
+          <w:bottom w:val="single" w:sz="4" w:space="1" w:color="CDD3D9"/>
+          <w:between w:val="single" w:sz="4" w:space="1" w:color="CDD3D9"/>
+        </w:pBdr>
+        <w:spacing w:before="0" w:after="0" w:line="500" w:lineRule="exact"/>
       </w:pPr>
-      <w:r>
-        <w:rPr>
-          <w:color w:val="CDD3D9"/>
-          <w:sz w:val="18"/>
-        </w:rPr>
-        <w:t>________________________________________________________________________________</w:t>
-      </w:r>
     </w:p>
     <w:p>
       <w:pPr>
-        <w:spacing w:after="40"/>
+        <w:pBdr>
+          <w:bottom w:val="single" w:sz="4" w:space="1" w:color="CDD3D9"/>
+          <w:between w:val="single" w:sz="4" w:space="1" w:color="CDD3D9"/>
+        </w:pBdr>
+        <w:spacing w:before="0" w:after="0" w:line="500" w:lineRule="exact"/>
       </w:pPr>
-      <w:r>
-        <w:rPr>
-          <w:color w:val="CDD3D9"/>
-          <w:sz w:val="18"/>
-        </w:rPr>
-        <w:t>________________________________________________________________________________</w:t>
-      </w:r>
+    </w:p>
+    <w:p>
+      <w:pPr>
+        <w:pBdr>
+          <w:bottom w:val="single" w:sz="4" w:space="1" w:color="CDD3D9"/>
+          <w:between w:val="single" w:sz="4" w:space="1" w:color="CDD3D9"/>
+        </w:pBdr>
+        <w:spacing w:before="0" w:after="0" w:line="500" w:lineRule="exact"/>
+      </w:pPr>
+    </w:p>
+    <w:p>
+      <w:pPr>
+        <w:spacing w:after="0" w:line="140" w:lineRule="exact"/>
+      </w:pPr>
     </w:p>
     <w:p>
       <w:r>
@@ -2138,99 +2712,98 @@
     </w:p>
     <w:p>
       <w:pPr>
-        <w:spacing w:after="40"/>
+        <w:pBdr>
+          <w:bottom w:val="single" w:sz="4" w:space="1" w:color="CDD3D9"/>
+          <w:between w:val="single" w:sz="4" w:space="1" w:color="CDD3D9"/>
+        </w:pBdr>
+        <w:spacing w:before="0" w:after="0" w:line="500" w:lineRule="exact"/>
       </w:pPr>
-      <w:r>
-        <w:rPr>
-          <w:color w:val="CDD3D9"/>
-          <w:sz w:val="18"/>
-        </w:rPr>
-        <w:t>________________________________________________________________________________</w:t>
-      </w:r>
     </w:p>
     <w:p>
       <w:pPr>
-        <w:spacing w:after="40"/>
+        <w:pBdr>
+          <w:bottom w:val="single" w:sz="4" w:space="1" w:color="CDD3D9"/>
+          <w:between w:val="single" w:sz="4" w:space="1" w:color="CDD3D9"/>
+        </w:pBdr>
+        <w:spacing w:before="0" w:after="0" w:line="500" w:lineRule="exact"/>
       </w:pPr>
-      <w:r>
-        <w:rPr>
-          <w:color w:val="CDD3D9"/>
-          <w:sz w:val="18"/>
-        </w:rPr>
-        <w:t>________________________________________________________________________________</w:t>
-      </w:r>
     </w:p>
     <w:p>
       <w:pPr>
-        <w:spacing w:after="40"/>
+        <w:pBdr>
+          <w:bottom w:val="single" w:sz="4" w:space="1" w:color="CDD3D9"/>
+          <w:between w:val="single" w:sz="4" w:space="1" w:color="CDD3D9"/>
+        </w:pBdr>
+        <w:spacing w:before="0" w:after="0" w:line="500" w:lineRule="exact"/>
       </w:pPr>
-      <w:r>
-        <w:rPr>
-          <w:color w:val="CDD3D9"/>
-          <w:sz w:val="18"/>
-        </w:rPr>
-        <w:t>________________________________________________________________________________</w:t>
-      </w:r>
     </w:p>
     <w:p>
       <w:pPr>
-        <w:spacing w:after="40"/>
+        <w:pBdr>
+          <w:bottom w:val="single" w:sz="4" w:space="1" w:color="CDD3D9"/>
+          <w:between w:val="single" w:sz="4" w:space="1" w:color="CDD3D9"/>
+        </w:pBdr>
+        <w:spacing w:before="0" w:after="0" w:line="500" w:lineRule="exact"/>
       </w:pPr>
-      <w:r>
-        <w:rPr>
-          <w:color w:val="CDD3D9"/>
-          <w:sz w:val="18"/>
-        </w:rPr>
-        <w:t>________________________________________________________________________________</w:t>
-      </w:r>
     </w:p>
     <w:p>
       <w:pPr>
-        <w:spacing w:after="40"/>
+        <w:pBdr>
+          <w:bottom w:val="single" w:sz="4" w:space="1" w:color="CDD3D9"/>
+          <w:between w:val="single" w:sz="4" w:space="1" w:color="CDD3D9"/>
+        </w:pBdr>
+        <w:spacing w:before="0" w:after="0" w:line="500" w:lineRule="exact"/>
       </w:pPr>
-      <w:r>
-        <w:rPr>
-          <w:color w:val="CDD3D9"/>
-          <w:sz w:val="18"/>
-        </w:rPr>
-        <w:t>________________________________________________________________________________</w:t>
-      </w:r>
     </w:p>
     <w:p>
       <w:pPr>
-        <w:spacing w:after="40"/>
+        <w:pBdr>
+          <w:bottom w:val="single" w:sz="4" w:space="1" w:color="CDD3D9"/>
+          <w:between w:val="single" w:sz="4" w:space="1" w:color="CDD3D9"/>
+        </w:pBdr>
+        <w:spacing w:before="0" w:after="0" w:line="500" w:lineRule="exact"/>
       </w:pPr>
-      <w:r>
-        <w:rPr>
-          <w:color w:val="CDD3D9"/>
-          <w:sz w:val="18"/>
-        </w:rPr>
-        <w:t>________________________________________________________________________________</w:t>
-      </w:r>
     </w:p>
     <w:p>
       <w:pPr>
-        <w:spacing w:after="40"/>
+        <w:pBdr>
+          <w:bottom w:val="single" w:sz="4" w:space="1" w:color="CDD3D9"/>
+          <w:between w:val="single" w:sz="4" w:space="1" w:color="CDD3D9"/>
+        </w:pBdr>
+        <w:spacing w:before="0" w:after="0" w:line="500" w:lineRule="exact"/>
       </w:pPr>
-      <w:r>
-        <w:rPr>
-          <w:color w:val="CDD3D9"/>
-          <w:sz w:val="18"/>
-        </w:rPr>
-        <w:t>________________________________________________________________________________</w:t>
-      </w:r>
     </w:p>
     <w:p>
       <w:pPr>
-        <w:spacing w:after="40"/>
+        <w:pBdr>
+          <w:bottom w:val="single" w:sz="4" w:space="1" w:color="CDD3D9"/>
+          <w:between w:val="single" w:sz="4" w:space="1" w:color="CDD3D9"/>
+        </w:pBdr>
+        <w:spacing w:before="0" w:after="0" w:line="500" w:lineRule="exact"/>
       </w:pPr>
-      <w:r>
-        <w:rPr>
-          <w:color w:val="CDD3D9"/>
-          <w:sz w:val="18"/>
-        </w:rPr>
-        <w:t>________________________________________________________________________________</w:t>
-      </w:r>
+    </w:p>
+    <w:p>
+      <w:pPr>
+        <w:pBdr>
+          <w:bottom w:val="single" w:sz="4" w:space="1" w:color="CDD3D9"/>
+          <w:between w:val="single" w:sz="4" w:space="1" w:color="CDD3D9"/>
+        </w:pBdr>
+        <w:spacing w:before="0" w:after="0" w:line="500" w:lineRule="exact"/>
+      </w:pPr>
+    </w:p>
+    <w:p>
+      <w:pPr>
+        <w:pBdr>
+          <w:bottom w:val="single" w:sz="4" w:space="1" w:color="CDD3D9"/>
+          <w:between w:val="single" w:sz="4" w:space="1" w:color="CDD3D9"/>
+        </w:pBdr>
+        <w:spacing w:before="0" w:after="0" w:line="500" w:lineRule="exact"/>
+      </w:pPr>
+    </w:p>
+    <w:p>
+      <w:pPr>
+        <w:spacing w:after="0" w:line="140" w:lineRule="exact"/>
+      </w:pPr>
     </w:p>
     <w:p>
       <w:pPr>
@@ -2252,39 +2825,44 @@
     </w:p>
     <w:p>
       <w:pPr>
-        <w:spacing w:after="40"/>
+        <w:pBdr>
+          <w:bottom w:val="single" w:sz="4" w:space="1" w:color="CDD3D9"/>
+          <w:between w:val="single" w:sz="4" w:space="1" w:color="CDD3D9"/>
+        </w:pBdr>
+        <w:spacing w:before="0" w:after="0" w:line="500" w:lineRule="exact"/>
       </w:pPr>
-      <w:r>
-        <w:rPr>
-          <w:color w:val="CDD3D9"/>
-          <w:sz w:val="18"/>
-        </w:rPr>
-        <w:t>________________________________________________________________________________</w:t>
-      </w:r>
     </w:p>
     <w:p>
       <w:pPr>
-        <w:spacing w:after="40"/>
+        <w:pBdr>
+          <w:bottom w:val="single" w:sz="4" w:space="1" w:color="CDD3D9"/>
+          <w:between w:val="single" w:sz="4" w:space="1" w:color="CDD3D9"/>
+        </w:pBdr>
+        <w:spacing w:before="0" w:after="0" w:line="500" w:lineRule="exact"/>
       </w:pPr>
-      <w:r>
-        <w:rPr>
-          <w:color w:val="CDD3D9"/>
-          <w:sz w:val="18"/>
-        </w:rPr>
-        <w:t>________________________________________________________________________________</w:t>
-      </w:r>
     </w:p>
     <w:p>
       <w:pPr>
-        <w:spacing w:after="40"/>
+        <w:pBdr>
+          <w:bottom w:val="single" w:sz="4" w:space="1" w:color="CDD3D9"/>
+          <w:between w:val="single" w:sz="4" w:space="1" w:color="CDD3D9"/>
+        </w:pBdr>
+        <w:spacing w:before="0" w:after="0" w:line="500" w:lineRule="exact"/>
       </w:pPr>
-      <w:r>
-        <w:rPr>
-          <w:color w:val="CDD3D9"/>
-          <w:sz w:val="18"/>
-        </w:rPr>
-        <w:t>________________________________________________________________________________</w:t>
-      </w:r>
+    </w:p>
+    <w:p>
+      <w:pPr>
+        <w:pBdr>
+          <w:bottom w:val="single" w:sz="4" w:space="1" w:color="CDD3D9"/>
+          <w:between w:val="single" w:sz="4" w:space="1" w:color="CDD3D9"/>
+        </w:pBdr>
+        <w:spacing w:before="0" w:after="0" w:line="500" w:lineRule="exact"/>
+      </w:pPr>
+    </w:p>
+    <w:p>
+      <w:pPr>
+        <w:spacing w:after="0" w:line="140" w:lineRule="exact"/>
+      </w:pPr>
     </w:p>
     <w:p>
       <w:r>
@@ -2293,36 +2871,69 @@
     </w:p>
     <w:p>
       <w:pPr>
-        <w:spacing w:after="40"/>
+        <w:pBdr>
+          <w:bottom w:val="single" w:sz="4" w:space="1" w:color="CDD3D9"/>
+          <w:between w:val="single" w:sz="4" w:space="1" w:color="CDD3D9"/>
+        </w:pBdr>
+        <w:spacing w:before="0" w:after="0" w:line="500" w:lineRule="exact"/>
       </w:pPr>
-      <w:r>
-        <w:rPr>
-          <w:color w:val="CDD3D9"/>
-          <w:sz w:val="18"/>
-        </w:rPr>
-        <w:t>________________________________________________________________________________</w:t>
-      </w:r>
     </w:p>
     <w:p>
       <w:pPr>
-        <w:spacing w:after="40"/>
+        <w:pBdr>
+          <w:bottom w:val="single" w:sz="4" w:space="1" w:color="CDD3D9"/>
+          <w:between w:val="single" w:sz="4" w:space="1" w:color="CDD3D9"/>
+        </w:pBdr>
+        <w:spacing w:before="0" w:after="0" w:line="500" w:lineRule="exact"/>
       </w:pPr>
-      <w:r>
-        <w:rPr>
-          <w:color w:val="CDD3D9"/>
-          <w:sz w:val="18"/>
-        </w:rPr>
-        <w:t>________________________________________________________________________________</w:t>
-      </w:r>
+    </w:p>
+    <w:p>
+      <w:pPr>
+        <w:pBdr>
+          <w:bottom w:val="single" w:sz="4" w:space="1" w:color="CDD3D9"/>
+          <w:between w:val="single" w:sz="4" w:space="1" w:color="CDD3D9"/>
+        </w:pBdr>
+        <w:spacing w:before="0" w:after="0" w:line="500" w:lineRule="exact"/>
+      </w:pPr>
+    </w:p>
+    <w:p>
+      <w:pPr>
+        <w:spacing w:after="0" w:line="140" w:lineRule="exact"/>
+      </w:pPr>
     </w:p>
     <w:sectPr>
-      <w:pgSz w:w="12240" w:h="15840"/>
+      <w:footerReference w:type="default" r:id="rId9"/>
+      <w:pgSz w:w="11906" w:h="16838"/>
       <w:pgMar w:top="648" w:right="864" w:bottom="835" w:left="864" w:header="720" w:footer="720" w:gutter="0"/>
       <w:cols w:space="720"/>
       <w:docGrid w:linePitch="360"/>
     </w:sectPr>
   </w:body>
 </w:document>
+</file>
+
+<file path=word/footer1.xml><?xml version="1.0" encoding="utf-8"?>
+<w:ftr xmlns:m="http://schemas.openxmlformats.org/officeDocument/2006/math" xmlns:mc="http://schemas.openxmlformats.org/markup-compatibility/2006" xmlns:mo="http://schemas.microsoft.com/office/mac/office/2008/main" xmlns:mv="urn:schemas-microsoft-com:mac:vml" xmlns:o="urn:schemas-microsoft-com:office:office" xmlns:r="http://schemas.openxmlformats.org/officeDocument/2006/relationships" xmlns:v="urn:schemas-microsoft-com:vml" xmlns:w10="urn:schemas-microsoft-com:office:word" xmlns:w14="http://schemas.microsoft.com/office/word/2010/wordml" xmlns:w="http://schemas.openxmlformats.org/wordprocessingml/2006/main" xmlns:wne="http://schemas.microsoft.com/office/word/2006/wordml" xmlns:wp14="http://schemas.microsoft.com/office/word/2010/wordprocessingDrawing" xmlns:wp="http://schemas.openxmlformats.org/drawingml/2006/wordprocessingDrawing" xmlns:wpc="http://schemas.microsoft.com/office/word/2010/wordprocessingCanvas" xmlns:wpg="http://schemas.microsoft.com/office/word/2010/wordprocessingGroup" xmlns:wpi="http://schemas.microsoft.com/office/word/2010/wordprocessingInk" xmlns:wps="http://schemas.microsoft.com/office/word/2010/wordprocessingShape" mc:Ignorable="w14 wp14">
+  <w:p>
+    <w:pPr>
+      <w:pStyle w:val="Footer"/>
+    </w:pPr>
+    <w:r>
+      <w:rPr>
+        <w:sz w:val="16"/>
+      </w:rPr>
+      <w:t xml:space="preserve">TBS-ECO-20261010-v1.2 | THE BUSINESS SCHOOL | page </w:t>
+    </w:r>
+    <w:fldSimple w:instr="PAGE">
+      <w:r>
+        <w:rPr>
+          <w:sz w:val="16"/>
+        </w:rPr>
+        <w:t>1</w:t>
+      </w:r>
+    </w:fldSimple>
+  </w:p>
+</w:ftr>
 </file>
 
 <file path=word/numbering.xml><?xml version="1.0" encoding="utf-8"?>
@@ -2752,7 +3363,7 @@
     <w:pPr>
       <w:keepNext/>
       <w:keepLines/>
-      <w:spacing w:before="480" w:after="0"/>
+      <w:spacing w:before="240" w:after="0"/>
       <w:outlineLvl w:val="0"/>
     </w:pPr>
     <w:rPr>

</xml_diff>